<commit_message>
Add PDF processing scripts for renaming, merging, and splitting files; enhance .gitignore
Co-authored-by: Copilot <copilot@github.com>
</commit_message>
<xml_diff>
--- a/Tests/AngewandteMathematik/Test2/AWII_Pruefung_SS2026_Pr2_Angabe.docx
+++ b/Tests/AngewandteMathematik/Test2/AWII_Pruefung_SS2026_Pr2_Angabe.docx
@@ -1477,24 +1477,14 @@
         </w:rPr>
         <w:t>_________</w:t>
       </w:r>
-      <w:proofErr w:type="gramStart"/>
       <w:r>
         <w:rPr>
           <w:rFonts w:ascii="Times New Roman" w:hAnsi="Times New Roman" w:cs="Times New Roman"/>
           <w:sz w:val="36"/>
           <w:szCs w:val="36"/>
         </w:rPr>
-        <w:t>_</w:t>
-      </w:r>
-      <w:r>
-        <w:rPr>
-          <w:rFonts w:ascii="Times New Roman" w:hAnsi="Times New Roman" w:cs="Times New Roman"/>
-          <w:sz w:val="36"/>
-          <w:szCs w:val="36"/>
-        </w:rPr>
-        <w:t xml:space="preserve"> ]</w:t>
-      </w:r>
-      <w:proofErr w:type="gramEnd"/>
+        <w:t>]</w:t>
+      </w:r>
     </w:p>
     <w:p>
       <w:pPr>
@@ -1520,8 +1510,6 @@
         <w:jc w:val="center"/>
         <w:rPr>
           <w:rFonts w:ascii="Times New Roman" w:hAnsi="Times New Roman" w:cs="Times New Roman"/>
-          <w:i/>
-          <w:iCs/>
           <w:color w:val="808080" w:themeColor="background1" w:themeShade="80"/>
           <w:sz w:val="20"/>
           <w:szCs w:val="20"/>
@@ -1530,220 +1518,87 @@
       <w:r>
         <w:rPr>
           <w:rFonts w:ascii="Times New Roman" w:hAnsi="Times New Roman" w:cs="Times New Roman"/>
-          <w:i/>
-          <w:iCs/>
           <w:color w:val="808080" w:themeColor="background1" w:themeShade="80"/>
           <w:sz w:val="20"/>
           <w:szCs w:val="20"/>
         </w:rPr>
-        <w:t xml:space="preserve">Notenschlüssel: Sehr gut </w:t>
-      </w:r>
-      <w:proofErr w:type="gramStart"/>
-      <w:r>
-        <w:rPr>
-          <w:rFonts w:ascii="Times New Roman" w:hAnsi="Times New Roman" w:cs="Times New Roman"/>
-          <w:i/>
-          <w:iCs/>
+        <w:t>Notenschlüssel: Sehr gut (</w:t>
+      </w:r>
+      <w:r>
+        <w:rPr>
+          <w:rStyle w:val="hgkelc"/>
+          <w:rFonts w:ascii="Times New Roman" w:hAnsi="Times New Roman" w:cs="Times New Roman"/>
           <w:color w:val="808080" w:themeColor="background1" w:themeShade="80"/>
           <w:sz w:val="20"/>
           <w:szCs w:val="20"/>
         </w:rPr>
-        <w:t xml:space="preserve">( </w:t>
-      </w:r>
-      <w:r>
-        <w:rPr>
-          <w:rStyle w:val="hgkelc"/>
+        <w:t>≥</w:t>
+      </w:r>
+      <w:r>
+        <w:rPr>
           <w:rFonts w:ascii="Times New Roman" w:hAnsi="Times New Roman" w:cs="Times New Roman"/>
           <w:color w:val="808080" w:themeColor="background1" w:themeShade="80"/>
           <w:sz w:val="20"/>
           <w:szCs w:val="20"/>
         </w:rPr>
-        <w:t>≥</w:t>
-      </w:r>
-      <w:proofErr w:type="gramEnd"/>
-      <w:r>
-        <w:rPr>
-          <w:rFonts w:ascii="Times New Roman" w:hAnsi="Times New Roman" w:cs="Times New Roman"/>
-          <w:i/>
-          <w:iCs/>
+        <w:t xml:space="preserve"> 54), Gut (</w:t>
+      </w:r>
+      <w:r>
+        <w:rPr>
+          <w:rStyle w:val="hgkelc"/>
+          <w:rFonts w:ascii="Times New Roman" w:hAnsi="Times New Roman" w:cs="Times New Roman"/>
           <w:color w:val="808080" w:themeColor="background1" w:themeShade="80"/>
           <w:sz w:val="20"/>
           <w:szCs w:val="20"/>
         </w:rPr>
-        <w:t xml:space="preserve"> </w:t>
-      </w:r>
-      <w:r>
-        <w:rPr>
-          <w:rFonts w:ascii="Times New Roman" w:hAnsi="Times New Roman" w:cs="Times New Roman"/>
-          <w:i/>
-          <w:iCs/>
+        <w:t>≥</w:t>
+      </w:r>
+      <w:r>
+        <w:rPr>
+          <w:rFonts w:ascii="Times New Roman" w:hAnsi="Times New Roman" w:cs="Times New Roman"/>
           <w:color w:val="808080" w:themeColor="background1" w:themeShade="80"/>
           <w:sz w:val="20"/>
           <w:szCs w:val="20"/>
         </w:rPr>
-        <w:t>54</w:t>
-      </w:r>
-      <w:r>
-        <w:rPr>
-          <w:rFonts w:ascii="Times New Roman" w:hAnsi="Times New Roman" w:cs="Times New Roman"/>
-          <w:i/>
-          <w:iCs/>
+        <w:t xml:space="preserve"> 48), Befriedigend (</w:t>
+      </w:r>
+      <w:r>
+        <w:rPr>
+          <w:rStyle w:val="hgkelc"/>
+          <w:rFonts w:ascii="Times New Roman" w:hAnsi="Times New Roman" w:cs="Times New Roman"/>
           <w:color w:val="808080" w:themeColor="background1" w:themeShade="80"/>
           <w:sz w:val="20"/>
           <w:szCs w:val="20"/>
         </w:rPr>
-        <w:t xml:space="preserve">), Gut ( </w:t>
-      </w:r>
-      <w:r>
-        <w:rPr>
-          <w:rStyle w:val="hgkelc"/>
+        <w:t>≥</w:t>
+      </w:r>
+      <w:r>
+        <w:rPr>
           <w:rFonts w:ascii="Times New Roman" w:hAnsi="Times New Roman" w:cs="Times New Roman"/>
           <w:color w:val="808080" w:themeColor="background1" w:themeShade="80"/>
           <w:sz w:val="20"/>
           <w:szCs w:val="20"/>
         </w:rPr>
-        <w:t>≥</w:t>
-      </w:r>
-      <w:r>
-        <w:rPr>
-          <w:rFonts w:ascii="Times New Roman" w:hAnsi="Times New Roman" w:cs="Times New Roman"/>
-          <w:i/>
-          <w:iCs/>
+        <w:t xml:space="preserve"> 42), Genügend (</w:t>
+      </w:r>
+      <w:r>
+        <w:rPr>
+          <w:rStyle w:val="hgkelc"/>
+          <w:rFonts w:ascii="Times New Roman" w:hAnsi="Times New Roman" w:cs="Times New Roman"/>
           <w:color w:val="808080" w:themeColor="background1" w:themeShade="80"/>
           <w:sz w:val="20"/>
           <w:szCs w:val="20"/>
         </w:rPr>
-        <w:t xml:space="preserve"> </w:t>
-      </w:r>
-      <w:r>
-        <w:rPr>
-          <w:rFonts w:ascii="Times New Roman" w:hAnsi="Times New Roman" w:cs="Times New Roman"/>
-          <w:i/>
-          <w:iCs/>
+        <w:t>≥</w:t>
+      </w:r>
+      <w:r>
+        <w:rPr>
+          <w:rFonts w:ascii="Times New Roman" w:hAnsi="Times New Roman" w:cs="Times New Roman"/>
           <w:color w:val="808080" w:themeColor="background1" w:themeShade="80"/>
           <w:sz w:val="20"/>
           <w:szCs w:val="20"/>
         </w:rPr>
-        <w:t>48</w:t>
-      </w:r>
-      <w:r>
-        <w:rPr>
-          <w:rFonts w:ascii="Times New Roman" w:hAnsi="Times New Roman" w:cs="Times New Roman"/>
-          <w:i/>
-          <w:iCs/>
-          <w:color w:val="808080" w:themeColor="background1" w:themeShade="80"/>
-          <w:sz w:val="20"/>
-          <w:szCs w:val="20"/>
-        </w:rPr>
-        <w:t xml:space="preserve">), Befriedigend ( </w:t>
-      </w:r>
-      <w:r>
-        <w:rPr>
-          <w:rStyle w:val="hgkelc"/>
-          <w:rFonts w:ascii="Times New Roman" w:hAnsi="Times New Roman" w:cs="Times New Roman"/>
-          <w:color w:val="808080" w:themeColor="background1" w:themeShade="80"/>
-          <w:sz w:val="20"/>
-          <w:szCs w:val="20"/>
-        </w:rPr>
-        <w:t>≥</w:t>
-      </w:r>
-      <w:r>
-        <w:rPr>
-          <w:rFonts w:ascii="Times New Roman" w:hAnsi="Times New Roman" w:cs="Times New Roman"/>
-          <w:i/>
-          <w:iCs/>
-          <w:color w:val="808080" w:themeColor="background1" w:themeShade="80"/>
-          <w:sz w:val="20"/>
-          <w:szCs w:val="20"/>
-        </w:rPr>
-        <w:t xml:space="preserve"> </w:t>
-      </w:r>
-      <w:r>
-        <w:rPr>
-          <w:rFonts w:ascii="Times New Roman" w:hAnsi="Times New Roman" w:cs="Times New Roman"/>
-          <w:i/>
-          <w:iCs/>
-          <w:color w:val="808080" w:themeColor="background1" w:themeShade="80"/>
-          <w:sz w:val="20"/>
-          <w:szCs w:val="20"/>
-        </w:rPr>
-        <w:t>42</w:t>
-      </w:r>
-      <w:r>
-        <w:rPr>
-          <w:rFonts w:ascii="Times New Roman" w:hAnsi="Times New Roman" w:cs="Times New Roman"/>
-          <w:i/>
-          <w:iCs/>
-          <w:color w:val="808080" w:themeColor="background1" w:themeShade="80"/>
-          <w:sz w:val="20"/>
-          <w:szCs w:val="20"/>
-        </w:rPr>
-        <w:t xml:space="preserve">), Genügend ( </w:t>
-      </w:r>
-      <w:r>
-        <w:rPr>
-          <w:rStyle w:val="hgkelc"/>
-          <w:rFonts w:ascii="Times New Roman" w:hAnsi="Times New Roman" w:cs="Times New Roman"/>
-          <w:color w:val="808080" w:themeColor="background1" w:themeShade="80"/>
-          <w:sz w:val="20"/>
-          <w:szCs w:val="20"/>
-        </w:rPr>
-        <w:t>≥</w:t>
-      </w:r>
-      <w:r>
-        <w:rPr>
-          <w:rFonts w:ascii="Times New Roman" w:hAnsi="Times New Roman" w:cs="Times New Roman"/>
-          <w:i/>
-          <w:iCs/>
-          <w:color w:val="808080" w:themeColor="background1" w:themeShade="80"/>
-          <w:sz w:val="20"/>
-          <w:szCs w:val="20"/>
-        </w:rPr>
-        <w:t xml:space="preserve"> </w:t>
-      </w:r>
-      <w:r>
-        <w:rPr>
-          <w:rFonts w:ascii="Times New Roman" w:hAnsi="Times New Roman" w:cs="Times New Roman"/>
-          <w:i/>
-          <w:iCs/>
-          <w:color w:val="808080" w:themeColor="background1" w:themeShade="80"/>
-          <w:sz w:val="20"/>
-          <w:szCs w:val="20"/>
-        </w:rPr>
-        <w:t>36</w:t>
-      </w:r>
-      <w:r>
-        <w:rPr>
-          <w:rFonts w:ascii="Times New Roman" w:hAnsi="Times New Roman" w:cs="Times New Roman"/>
-          <w:i/>
-          <w:iCs/>
-          <w:color w:val="808080" w:themeColor="background1" w:themeShade="80"/>
-          <w:sz w:val="20"/>
-          <w:szCs w:val="20"/>
-        </w:rPr>
-        <w:t xml:space="preserve"> ), Nicht Genügend (&lt; </w:t>
-      </w:r>
-      <w:r>
-        <w:rPr>
-          <w:rFonts w:ascii="Times New Roman" w:hAnsi="Times New Roman" w:cs="Times New Roman"/>
-          <w:i/>
-          <w:iCs/>
-          <w:color w:val="808080" w:themeColor="background1" w:themeShade="80"/>
-          <w:sz w:val="20"/>
-          <w:szCs w:val="20"/>
-        </w:rPr>
-        <w:t>36</w:t>
-      </w:r>
-      <w:r>
-        <w:rPr>
-          <w:rFonts w:ascii="Times New Roman" w:hAnsi="Times New Roman" w:cs="Times New Roman"/>
-          <w:i/>
-          <w:iCs/>
-          <w:color w:val="808080" w:themeColor="background1" w:themeShade="80"/>
-          <w:sz w:val="20"/>
-          <w:szCs w:val="20"/>
-        </w:rPr>
-        <w:t>)</w:t>
+        <w:t xml:space="preserve"> 36), Nicht Genügend (&lt; 36)</w:t>
       </w:r>
     </w:p>
     <w:p>
@@ -5094,7 +4949,18 @@
                     <w:sz w:val="24"/>
                     <w:szCs w:val="24"/>
                   </w:rPr>
-                  <m:t>→0</m:t>
+                  <m:t>→</m:t>
+                </m:r>
+                <m:r>
+                  <m:rPr>
+                    <m:sty m:val="p"/>
+                  </m:rPr>
+                  <w:rPr>
+                    <w:rFonts w:ascii="Cambria Math" w:hAnsi="Cambria Math" w:cs="Times New Roman"/>
+                    <w:sz w:val="24"/>
+                    <w:szCs w:val="24"/>
+                  </w:rPr>
+                  <m:t>0</m:t>
                 </m:r>
               </m:lim>
             </m:limLow>

</xml_diff>